<commit_message>
supprimer les dossiers giu et venv_python
</commit_message>
<xml_diff>
--- a/projet/Compte_Rendu_LEPAGE_SCHELTIEN.docx
+++ b/projet/Compte_Rendu_LEPAGE_SCHELTIEN.docx
@@ -4,7 +4,7 @@
   <w:body>
     <w:p>
       <w:pPr>
-        <w:pStyle w:val="Sansinterligne"/>
+        <w:pStyle w:val="NoSpacing"/>
       </w:pPr>
       <w:r>
         <w:t>SCHELTIEN Mattéo</w:t>
@@ -43,7 +43,7 @@
     </w:p>
     <w:p>
       <w:pPr>
-        <w:pStyle w:val="Sansinterligne"/>
+        <w:pStyle w:val="NoSpacing"/>
       </w:pPr>
       <w:r>
         <w:t>LEPAGE Thomas</w:t>
@@ -51,17 +51,17 @@
     </w:p>
     <w:p>
       <w:pPr>
-        <w:pStyle w:val="Sansinterligne"/>
-      </w:pPr>
-    </w:p>
-    <w:p>
-      <w:pPr>
-        <w:pStyle w:val="Sansinterligne"/>
-      </w:pPr>
-    </w:p>
-    <w:p>
-      <w:pPr>
-        <w:pStyle w:val="Sansinterligne"/>
+        <w:pStyle w:val="NoSpacing"/>
+      </w:pPr>
+    </w:p>
+    <w:p>
+      <w:pPr>
+        <w:pStyle w:val="NoSpacing"/>
+      </w:pPr>
+    </w:p>
+    <w:p>
+      <w:pPr>
+        <w:pStyle w:val="NoSpacing"/>
         <w:ind w:left="708"/>
         <w:rPr>
           <w:b/>
@@ -96,17 +96,17 @@
     </w:p>
     <w:p>
       <w:pPr>
-        <w:pStyle w:val="Sansinterligne"/>
-      </w:pPr>
-    </w:p>
-    <w:p>
-      <w:pPr>
-        <w:pStyle w:val="Sansinterligne"/>
-      </w:pPr>
-    </w:p>
-    <w:p>
-      <w:pPr>
-        <w:pStyle w:val="Sansinterligne"/>
+        <w:pStyle w:val="NoSpacing"/>
+      </w:pPr>
+    </w:p>
+    <w:p>
+      <w:pPr>
+        <w:pStyle w:val="NoSpacing"/>
+      </w:pPr>
+    </w:p>
+    <w:p>
+      <w:pPr>
+        <w:pStyle w:val="NoSpacing"/>
         <w:rPr>
           <w:b/>
           <w:bCs/>
@@ -124,12 +124,12 @@
     </w:p>
     <w:p>
       <w:pPr>
-        <w:pStyle w:val="Sansinterligne"/>
-      </w:pPr>
-    </w:p>
-    <w:p>
-      <w:pPr>
-        <w:pStyle w:val="Sansinterligne"/>
+        <w:pStyle w:val="NoSpacing"/>
+      </w:pPr>
+    </w:p>
+    <w:p>
+      <w:pPr>
+        <w:pStyle w:val="NoSpacing"/>
       </w:pPr>
       <w:r>
         <w:t>Dans ce projet, nous avons dû représenter un graphe orienté et calculer les plus courts chemins</w:t>
@@ -140,12 +140,12 @@
     </w:p>
     <w:p>
       <w:pPr>
-        <w:pStyle w:val="Sansinterligne"/>
-      </w:pPr>
-    </w:p>
-    <w:p>
-      <w:pPr>
-        <w:pStyle w:val="Sansinterligne"/>
+        <w:pStyle w:val="NoSpacing"/>
+      </w:pPr>
+    </w:p>
+    <w:p>
+      <w:pPr>
+        <w:pStyle w:val="NoSpacing"/>
       </w:pPr>
       <w:r>
         <w:t>Nous représentons nos graphes sous formes de liste d’adjacence, dans laquelle chaque sommet est une chaine de caractères, accompagné de son poids / cout.</w:t>
@@ -153,17 +153,17 @@
     </w:p>
     <w:p>
       <w:pPr>
-        <w:pStyle w:val="Sansinterligne"/>
-      </w:pPr>
-    </w:p>
-    <w:p>
-      <w:pPr>
-        <w:pStyle w:val="Sansinterligne"/>
-      </w:pPr>
-    </w:p>
-    <w:p>
-      <w:pPr>
-        <w:pStyle w:val="Sansinterligne"/>
+        <w:pStyle w:val="NoSpacing"/>
+      </w:pPr>
+    </w:p>
+    <w:p>
+      <w:pPr>
+        <w:pStyle w:val="NoSpacing"/>
+      </w:pPr>
+    </w:p>
+    <w:p>
+      <w:pPr>
+        <w:pStyle w:val="NoSpacing"/>
         <w:rPr>
           <w:b/>
           <w:bCs/>
@@ -181,7 +181,7 @@
     </w:p>
     <w:p>
       <w:pPr>
-        <w:pStyle w:val="Sansinterligne"/>
+        <w:pStyle w:val="NoSpacing"/>
         <w:rPr>
           <w:u w:val="single"/>
         </w:rPr>
@@ -189,20 +189,27 @@
     </w:p>
     <w:p>
       <w:pPr>
-        <w:pStyle w:val="Sansinterligne"/>
-      </w:pPr>
-      <w:r>
-        <w:t xml:space="preserve">Arc : </w:t>
-      </w:r>
-    </w:p>
-    <w:p>
-      <w:pPr>
-        <w:pStyle w:val="Sansinterligne"/>
-      </w:pPr>
-    </w:p>
-    <w:p>
-      <w:pPr>
-        <w:pStyle w:val="Sansinterligne"/>
+        <w:pStyle w:val="NoSpacing"/>
+      </w:pPr>
+      <w:r>
+        <w:rPr>
+          <w:b/>
+          <w:bCs/>
+        </w:rPr>
+        <w:t>Arc</w:t>
+      </w:r>
+      <w:r>
+        <w:t xml:space="preserve"> : </w:t>
+      </w:r>
+    </w:p>
+    <w:p>
+      <w:pPr>
+        <w:pStyle w:val="NoSpacing"/>
+      </w:pPr>
+    </w:p>
+    <w:p>
+      <w:pPr>
+        <w:pStyle w:val="NoSpacing"/>
       </w:pPr>
       <w:r>
         <w:t>La classe représente un arc du graphe.</w:t>
@@ -210,7 +217,7 @@
     </w:p>
     <w:p>
       <w:pPr>
-        <w:pStyle w:val="Sansinterligne"/>
+        <w:pStyle w:val="NoSpacing"/>
       </w:pPr>
       <w:r>
         <w:t>Elle a comme attribut</w:t>
@@ -224,12 +231,12 @@
     </w:p>
     <w:p>
       <w:pPr>
-        <w:pStyle w:val="Sansinterligne"/>
-      </w:pPr>
-    </w:p>
-    <w:p>
-      <w:pPr>
-        <w:pStyle w:val="Sansinterligne"/>
+        <w:pStyle w:val="NoSpacing"/>
+      </w:pPr>
+    </w:p>
+    <w:p>
+      <w:pPr>
+        <w:pStyle w:val="NoSpacing"/>
         <w:numPr>
           <w:ilvl w:val="0"/>
           <w:numId w:val="5"/>
@@ -243,12 +250,24 @@
       <w:proofErr w:type="spellEnd"/>
       <w:proofErr w:type="gramEnd"/>
       <w:r>
-        <w:t>, un string qui représente le nœud cible de l’arc</w:t>
-      </w:r>
-    </w:p>
-    <w:p>
-      <w:pPr>
-        <w:pStyle w:val="Sansinterligne"/>
+        <w:t>, un</w:t>
+      </w:r>
+      <w:r>
+        <w:t>e</w:t>
+      </w:r>
+      <w:r>
+        <w:t xml:space="preserve"> </w:t>
+      </w:r>
+      <w:r>
+        <w:t xml:space="preserve">chaine de caractère </w:t>
+      </w:r>
+      <w:r>
+        <w:t>qui représente le nœud cible de l’arc</w:t>
+      </w:r>
+    </w:p>
+    <w:p>
+      <w:pPr>
+        <w:pStyle w:val="NoSpacing"/>
         <w:numPr>
           <w:ilvl w:val="0"/>
           <w:numId w:val="5"/>
@@ -262,26 +281,30 @@
       <w:r>
         <w:t xml:space="preserve">, un </w:t>
       </w:r>
-      <w:proofErr w:type="spellStart"/>
-      <w:r>
-        <w:t>int</w:t>
-      </w:r>
-      <w:proofErr w:type="spellEnd"/>
+      <w:r>
+        <w:t>entier</w:t>
+      </w:r>
       <w:r>
         <w:t xml:space="preserve"> qui représente le poids / cout de l’arc</w:t>
       </w:r>
     </w:p>
     <w:p>
       <w:pPr>
-        <w:pStyle w:val="Sansinterligne"/>
-      </w:pPr>
-    </w:p>
-    <w:p>
-      <w:pPr>
-        <w:pStyle w:val="Sansinterligne"/>
-      </w:pPr>
-      <w:r>
-        <w:t>Elle a comme méthode</w:t>
+        <w:pStyle w:val="NoSpacing"/>
+      </w:pPr>
+    </w:p>
+    <w:p>
+      <w:pPr>
+        <w:pStyle w:val="NoSpacing"/>
+      </w:pPr>
+      <w:r>
+        <w:t xml:space="preserve">Elle a comme </w:t>
+      </w:r>
+      <w:r>
+        <w:t xml:space="preserve">contient un constructeur et ces </w:t>
+      </w:r>
+      <w:r>
+        <w:t>méthode</w:t>
       </w:r>
       <w:r>
         <w:t>s</w:t>
@@ -292,7 +315,7 @@
     </w:p>
     <w:p>
       <w:pPr>
-        <w:pStyle w:val="Sansinterligne"/>
+        <w:pStyle w:val="NoSpacing"/>
         <w:numPr>
           <w:ilvl w:val="0"/>
           <w:numId w:val="5"/>
@@ -300,16 +323,16 @@
       </w:pPr>
       <w:proofErr w:type="gramStart"/>
       <w:r>
-        <w:t>un</w:t>
+        <w:t>deux</w:t>
       </w:r>
       <w:proofErr w:type="gramEnd"/>
       <w:r>
-        <w:t xml:space="preserve"> constructeur</w:t>
-      </w:r>
-    </w:p>
-    <w:p>
-      <w:pPr>
-        <w:pStyle w:val="Sansinterligne"/>
+        <w:t xml:space="preserve"> getters, un pour le poids et un pour le nœud cible</w:t>
+      </w:r>
+    </w:p>
+    <w:p>
+      <w:pPr>
+        <w:pStyle w:val="NoSpacing"/>
         <w:numPr>
           <w:ilvl w:val="0"/>
           <w:numId w:val="5"/>
@@ -317,123 +340,138 @@
       </w:pPr>
       <w:proofErr w:type="gramStart"/>
       <w:r>
-        <w:t>deux</w:t>
+        <w:t>une</w:t>
       </w:r>
       <w:proofErr w:type="gramEnd"/>
       <w:r>
-        <w:t xml:space="preserve"> getters, un pour le poids et un pour le nœud cible</w:t>
-      </w:r>
-    </w:p>
-    <w:p>
-      <w:pPr>
-        <w:pStyle w:val="Sansinterligne"/>
+        <w:t xml:space="preserve"> méthode </w:t>
+      </w:r>
+      <w:proofErr w:type="spellStart"/>
+      <w:proofErr w:type="gramStart"/>
+      <w:r>
+        <w:t>toString</w:t>
+      </w:r>
+      <w:proofErr w:type="spellEnd"/>
+      <w:r>
+        <w:t>(</w:t>
+      </w:r>
+      <w:proofErr w:type="gramEnd"/>
+      <w:r>
+        <w:t>) : String</w:t>
+      </w:r>
+    </w:p>
+    <w:p>
+      <w:pPr>
+        <w:pStyle w:val="NoSpacing"/>
+        <w:ind w:left="720"/>
+      </w:pPr>
+    </w:p>
+    <w:p>
+      <w:pPr>
+        <w:pStyle w:val="NoSpacing"/>
+      </w:pPr>
+    </w:p>
+    <w:p>
+      <w:pPr>
+        <w:pStyle w:val="NoSpacing"/>
+      </w:pPr>
+      <w:r>
+        <w:rPr>
+          <w:b/>
+          <w:bCs/>
+        </w:rPr>
+        <w:t>Arcs</w:t>
+      </w:r>
+      <w:r>
+        <w:t> :</w:t>
+      </w:r>
+    </w:p>
+    <w:p>
+      <w:pPr>
+        <w:pStyle w:val="NoSpacing"/>
+      </w:pPr>
+    </w:p>
+    <w:p>
+      <w:pPr>
+        <w:pStyle w:val="NoSpacing"/>
+      </w:pPr>
+      <w:r>
+        <w:t>La classe représente une liste d’Arc</w:t>
+      </w:r>
+    </w:p>
+    <w:p>
+      <w:pPr>
+        <w:pStyle w:val="NoSpacing"/>
+      </w:pPr>
+      <w:r>
+        <w:t>Elle a comme attributs :</w:t>
+      </w:r>
+    </w:p>
+    <w:p>
+      <w:pPr>
+        <w:pStyle w:val="NoSpacing"/>
+      </w:pPr>
+    </w:p>
+    <w:p>
+      <w:pPr>
+        <w:pStyle w:val="NoSpacing"/>
         <w:numPr>
           <w:ilvl w:val="0"/>
           <w:numId w:val="5"/>
         </w:numPr>
       </w:pPr>
+      <w:proofErr w:type="spellStart"/>
       <w:proofErr w:type="gramStart"/>
       <w:r>
-        <w:t>une</w:t>
-      </w:r>
+        <w:t>listeArcs</w:t>
+      </w:r>
+      <w:proofErr w:type="spellEnd"/>
       <w:proofErr w:type="gramEnd"/>
       <w:r>
-        <w:t xml:space="preserve"> méthode </w:t>
+        <w:t xml:space="preserve">, une </w:t>
       </w:r>
       <w:proofErr w:type="spellStart"/>
       <w:r>
-        <w:t>toString</w:t>
+        <w:t>arrayList</w:t>
       </w:r>
       <w:proofErr w:type="spellEnd"/>
-    </w:p>
-    <w:p>
-      <w:pPr>
-        <w:pStyle w:val="Sansinterligne"/>
-        <w:ind w:left="720"/>
-      </w:pPr>
-    </w:p>
-    <w:p>
-      <w:pPr>
-        <w:pStyle w:val="Sansinterligne"/>
-      </w:pPr>
-    </w:p>
-    <w:p>
-      <w:pPr>
-        <w:pStyle w:val="Sansinterligne"/>
-      </w:pPr>
-      <w:r>
-        <w:t>Arcs :</w:t>
-      </w:r>
-    </w:p>
-    <w:p>
-      <w:pPr>
-        <w:pStyle w:val="Sansinterligne"/>
-      </w:pPr>
-    </w:p>
-    <w:p>
-      <w:pPr>
-        <w:pStyle w:val="Sansinterligne"/>
-      </w:pPr>
-      <w:r>
-        <w:t>La classe représente une liste d’Arc</w:t>
-      </w:r>
-    </w:p>
-    <w:p>
-      <w:pPr>
-        <w:pStyle w:val="Sansinterligne"/>
-      </w:pPr>
-      <w:r>
-        <w:t>Elle a comme attributs :</w:t>
-      </w:r>
-    </w:p>
-    <w:p>
-      <w:pPr>
-        <w:pStyle w:val="Sansinterligne"/>
-      </w:pPr>
-    </w:p>
-    <w:p>
-      <w:pPr>
-        <w:pStyle w:val="Sansinterligne"/>
+      <w:r>
+        <w:t xml:space="preserve"> qui contient chaque Arc</w:t>
+      </w:r>
+    </w:p>
+    <w:p>
+      <w:pPr>
+        <w:pStyle w:val="NoSpacing"/>
+      </w:pPr>
+    </w:p>
+    <w:p>
+      <w:pPr>
+        <w:pStyle w:val="NoSpacing"/>
+      </w:pPr>
+      <w:r>
+        <w:t>Elle a comme méthodes :</w:t>
+      </w:r>
+    </w:p>
+    <w:p>
+      <w:pPr>
+        <w:pStyle w:val="NoSpacing"/>
         <w:numPr>
           <w:ilvl w:val="0"/>
           <w:numId w:val="5"/>
         </w:numPr>
       </w:pPr>
-      <w:proofErr w:type="spellStart"/>
       <w:proofErr w:type="gramStart"/>
       <w:r>
-        <w:t>listeArcs</w:t>
-      </w:r>
-      <w:proofErr w:type="spellEnd"/>
+        <w:t>un</w:t>
+      </w:r>
       <w:proofErr w:type="gramEnd"/>
       <w:r>
-        <w:t xml:space="preserve">, une </w:t>
-      </w:r>
-      <w:proofErr w:type="spellStart"/>
-      <w:r>
-        <w:t>arrayList</w:t>
-      </w:r>
-      <w:proofErr w:type="spellEnd"/>
-      <w:r>
-        <w:t xml:space="preserve"> qui représente contient chaque Arc</w:t>
-      </w:r>
-    </w:p>
-    <w:p>
-      <w:pPr>
-        <w:pStyle w:val="Sansinterligne"/>
-      </w:pPr>
-    </w:p>
-    <w:p>
-      <w:pPr>
-        <w:pStyle w:val="Sansinterligne"/>
-      </w:pPr>
-      <w:r>
-        <w:t>Elle a comme méthodes :</w:t>
-      </w:r>
-    </w:p>
-    <w:p>
-      <w:pPr>
-        <w:pStyle w:val="Sansinterligne"/>
+        <w:t xml:space="preserve"> constructeur vide</w:t>
+      </w:r>
+    </w:p>
+    <w:p>
+      <w:pPr>
+        <w:pStyle w:val="NoSpacing"/>
         <w:numPr>
           <w:ilvl w:val="0"/>
           <w:numId w:val="5"/>
@@ -441,16 +479,16 @@
       </w:pPr>
       <w:proofErr w:type="gramStart"/>
       <w:r>
-        <w:t>un</w:t>
+        <w:t>une</w:t>
       </w:r>
       <w:proofErr w:type="gramEnd"/>
       <w:r>
-        <w:t xml:space="preserve"> constructeur vide</w:t>
-      </w:r>
-    </w:p>
-    <w:p>
-      <w:pPr>
-        <w:pStyle w:val="Sansinterligne"/>
+        <w:t xml:space="preserve"> méthode d’ajout d’Arc à la liste</w:t>
+      </w:r>
+    </w:p>
+    <w:p>
+      <w:pPr>
+        <w:pStyle w:val="NoSpacing"/>
         <w:numPr>
           <w:ilvl w:val="0"/>
           <w:numId w:val="5"/>
@@ -458,16 +496,16 @@
       </w:pPr>
       <w:proofErr w:type="gramStart"/>
       <w:r>
-        <w:t>une</w:t>
+        <w:t>un</w:t>
       </w:r>
       <w:proofErr w:type="gramEnd"/>
       <w:r>
-        <w:t xml:space="preserve"> méthode d’ajout d’Arc à la liste</w:t>
-      </w:r>
-    </w:p>
-    <w:p>
-      <w:pPr>
-        <w:pStyle w:val="Sansinterligne"/>
+        <w:t xml:space="preserve"> getter</w:t>
+      </w:r>
+    </w:p>
+    <w:p>
+      <w:pPr>
+        <w:pStyle w:val="NoSpacing"/>
         <w:numPr>
           <w:ilvl w:val="0"/>
           <w:numId w:val="5"/>
@@ -479,128 +517,172 @@
       </w:r>
       <w:proofErr w:type="gramEnd"/>
       <w:r>
-        <w:t xml:space="preserve"> getter</w:t>
-      </w:r>
-    </w:p>
-    <w:p>
-      <w:pPr>
-        <w:pStyle w:val="Sansinterligne"/>
+        <w:t xml:space="preserve"> </w:t>
+      </w:r>
+      <w:proofErr w:type="spellStart"/>
+      <w:r>
+        <w:t>toString</w:t>
+      </w:r>
+      <w:proofErr w:type="spellEnd"/>
+    </w:p>
+    <w:p>
+      <w:pPr>
+        <w:pStyle w:val="NoSpacing"/>
+      </w:pPr>
+    </w:p>
+    <w:p>
+      <w:pPr>
+        <w:pStyle w:val="NoSpacing"/>
+      </w:pPr>
+    </w:p>
+    <w:p>
+      <w:pPr>
+        <w:pStyle w:val="NoSpacing"/>
+      </w:pPr>
+    </w:p>
+    <w:p>
+      <w:pPr>
+        <w:pStyle w:val="NoSpacing"/>
+      </w:pPr>
+    </w:p>
+    <w:p>
+      <w:pPr>
+        <w:pStyle w:val="NoSpacing"/>
+      </w:pPr>
+    </w:p>
+    <w:p>
+      <w:pPr>
+        <w:pStyle w:val="NoSpacing"/>
+      </w:pPr>
+    </w:p>
+    <w:p>
+      <w:pPr>
+        <w:pStyle w:val="NoSpacing"/>
+      </w:pPr>
+      <w:r>
+        <w:rPr>
+          <w:b/>
+          <w:bCs/>
+        </w:rPr>
+        <w:lastRenderedPageBreak/>
+        <w:t>Graphe</w:t>
+      </w:r>
+      <w:r>
+        <w:t> :</w:t>
+      </w:r>
+    </w:p>
+    <w:p>
+      <w:pPr>
+        <w:pStyle w:val="NoSpacing"/>
+      </w:pPr>
+    </w:p>
+    <w:p>
+      <w:pPr>
+        <w:pStyle w:val="NoSpacing"/>
+      </w:pPr>
+      <w:r>
+        <w:t xml:space="preserve">C’est une </w:t>
+      </w:r>
+      <w:r>
+        <w:t xml:space="preserve">interface qui permet de définir les méthodes à utiliser dans la classe </w:t>
+      </w:r>
+      <w:proofErr w:type="spellStart"/>
+      <w:r>
+        <w:t>GrapheListe</w:t>
+      </w:r>
+      <w:proofErr w:type="spellEnd"/>
+    </w:p>
+    <w:p>
+      <w:pPr>
+        <w:pStyle w:val="NoSpacing"/>
+      </w:pPr>
+    </w:p>
+    <w:p>
+      <w:pPr>
+        <w:pStyle w:val="NoSpacing"/>
+      </w:pPr>
+    </w:p>
+    <w:p>
+      <w:pPr>
+        <w:pStyle w:val="NoSpacing"/>
+      </w:pPr>
+      <w:proofErr w:type="spellStart"/>
+      <w:r>
+        <w:rPr>
+          <w:b/>
+          <w:bCs/>
+        </w:rPr>
+        <w:t>GrapheListe</w:t>
+      </w:r>
+      <w:proofErr w:type="spellEnd"/>
+      <w:r>
+        <w:t xml:space="preserve"> : </w:t>
+      </w:r>
+    </w:p>
+    <w:p>
+      <w:pPr>
+        <w:pStyle w:val="NoSpacing"/>
+      </w:pPr>
+    </w:p>
+    <w:p>
+      <w:pPr>
+        <w:pStyle w:val="NoSpacing"/>
+      </w:pPr>
+      <w:r>
+        <w:t xml:space="preserve">La classe représente un graphe sous forme de </w:t>
+      </w:r>
+      <w:proofErr w:type="spellStart"/>
+      <w:r>
+        <w:t>ArrayList</w:t>
+      </w:r>
+      <w:proofErr w:type="spellEnd"/>
+      <w:r>
+        <w:t>, en utilisant l’interface Graphe</w:t>
+      </w:r>
+    </w:p>
+    <w:p>
+      <w:pPr>
+        <w:pStyle w:val="NoSpacing"/>
+      </w:pPr>
+      <w:r>
+        <w:t>Elle a comme attributs :</w:t>
+      </w:r>
+    </w:p>
+    <w:p>
+      <w:pPr>
+        <w:pStyle w:val="NoSpacing"/>
+      </w:pPr>
+    </w:p>
+    <w:p>
+      <w:pPr>
+        <w:pStyle w:val="NoSpacing"/>
         <w:numPr>
           <w:ilvl w:val="0"/>
           <w:numId w:val="5"/>
         </w:numPr>
       </w:pPr>
+      <w:proofErr w:type="spellStart"/>
       <w:proofErr w:type="gramStart"/>
       <w:r>
-        <w:t>un</w:t>
-      </w:r>
+        <w:t>nodeList</w:t>
+      </w:r>
+      <w:proofErr w:type="spellEnd"/>
       <w:proofErr w:type="gramEnd"/>
       <w:r>
-        <w:t xml:space="preserve"> </w:t>
+        <w:t xml:space="preserve">, une </w:t>
       </w:r>
       <w:proofErr w:type="spellStart"/>
       <w:r>
-        <w:t>toString</w:t>
+        <w:t>arrayList</w:t>
       </w:r>
       <w:proofErr w:type="spellEnd"/>
-    </w:p>
-    <w:p>
-      <w:pPr>
-        <w:pStyle w:val="Sansinterligne"/>
-      </w:pPr>
-    </w:p>
-    <w:p>
-      <w:pPr>
-        <w:pStyle w:val="Sansinterligne"/>
-      </w:pPr>
-    </w:p>
-    <w:p>
-      <w:pPr>
-        <w:pStyle w:val="Sansinterligne"/>
-      </w:pPr>
-      <w:r>
-        <w:t>Graphe :</w:t>
-      </w:r>
-    </w:p>
-    <w:p>
-      <w:pPr>
-        <w:pStyle w:val="Sansinterligne"/>
-      </w:pPr>
-    </w:p>
-    <w:p>
-      <w:pPr>
-        <w:pStyle w:val="Sansinterligne"/>
-      </w:pPr>
-      <w:r>
-        <w:lastRenderedPageBreak/>
-        <w:t xml:space="preserve">La classe est une interface qui permet de définir les méthodes à utiliser dans la classe </w:t>
-      </w:r>
-      <w:proofErr w:type="spellStart"/>
-      <w:r>
-        <w:t>GrapheListe</w:t>
-      </w:r>
-      <w:proofErr w:type="spellEnd"/>
-    </w:p>
-    <w:p>
-      <w:pPr>
-        <w:pStyle w:val="Sansinterligne"/>
-      </w:pPr>
-    </w:p>
-    <w:p>
-      <w:pPr>
-        <w:pStyle w:val="Sansinterligne"/>
-      </w:pPr>
-    </w:p>
-    <w:p>
-      <w:pPr>
-        <w:pStyle w:val="Sansinterligne"/>
-      </w:pPr>
-      <w:proofErr w:type="spellStart"/>
-      <w:r>
-        <w:t>GrapheListe</w:t>
-      </w:r>
-      <w:proofErr w:type="spellEnd"/>
-      <w:r>
-        <w:t xml:space="preserve"> : </w:t>
-      </w:r>
-    </w:p>
-    <w:p>
-      <w:pPr>
-        <w:pStyle w:val="Sansinterligne"/>
-      </w:pPr>
-    </w:p>
-    <w:p>
-      <w:pPr>
-        <w:pStyle w:val="Sansinterligne"/>
-      </w:pPr>
-      <w:r>
-        <w:t xml:space="preserve">La classe représente un graphe sous forme de </w:t>
-      </w:r>
-      <w:proofErr w:type="spellStart"/>
-      <w:r>
-        <w:t>ArrayList</w:t>
-      </w:r>
-      <w:proofErr w:type="spellEnd"/>
-      <w:r>
-        <w:t>, en utilisant l’interface Graphe</w:t>
-      </w:r>
-    </w:p>
-    <w:p>
-      <w:pPr>
-        <w:pStyle w:val="Sansinterligne"/>
-      </w:pPr>
-      <w:r>
-        <w:t>Elle a comme attributs :</w:t>
-      </w:r>
-    </w:p>
-    <w:p>
-      <w:pPr>
-        <w:pStyle w:val="Sansinterligne"/>
-      </w:pPr>
-    </w:p>
-    <w:p>
-      <w:pPr>
-        <w:pStyle w:val="Sansinterligne"/>
+      <w:r>
+        <w:t xml:space="preserve"> contenant les nœuds</w:t>
+      </w:r>
+    </w:p>
+    <w:p>
+      <w:pPr>
+        <w:pStyle w:val="NoSpacing"/>
         <w:numPr>
           <w:ilvl w:val="0"/>
           <w:numId w:val="5"/>
@@ -609,7 +691,7 @@
       <w:proofErr w:type="spellStart"/>
       <w:proofErr w:type="gramStart"/>
       <w:r>
-        <w:t>nodeList</w:t>
+        <w:t>adjNodeList</w:t>
       </w:r>
       <w:proofErr w:type="spellEnd"/>
       <w:proofErr w:type="gramEnd"/>
@@ -622,79 +704,71 @@
       </w:r>
       <w:proofErr w:type="spellEnd"/>
       <w:r>
-        <w:t xml:space="preserve"> contenant les nœuds</w:t>
-      </w:r>
-    </w:p>
-    <w:p>
-      <w:pPr>
-        <w:pStyle w:val="Sansinterligne"/>
+        <w:t xml:space="preserve"> contenant les nœuds adjacents aux nœuds de </w:t>
+      </w:r>
+      <w:proofErr w:type="spellStart"/>
+      <w:r>
+        <w:t>nodeList</w:t>
+      </w:r>
+      <w:proofErr w:type="spellEnd"/>
+    </w:p>
+    <w:p>
+      <w:pPr>
+        <w:pStyle w:val="NoSpacing"/>
+      </w:pPr>
+    </w:p>
+    <w:p>
+      <w:pPr>
+        <w:pStyle w:val="NoSpacing"/>
+      </w:pPr>
+      <w:r>
+        <w:t xml:space="preserve">Elle a comme méthodes : </w:t>
+      </w:r>
+    </w:p>
+    <w:p>
+      <w:pPr>
+        <w:pStyle w:val="NoSpacing"/>
+      </w:pPr>
+    </w:p>
+    <w:p>
+      <w:pPr>
+        <w:pStyle w:val="NoSpacing"/>
         <w:numPr>
           <w:ilvl w:val="0"/>
           <w:numId w:val="5"/>
         </w:numPr>
       </w:pPr>
-      <w:proofErr w:type="spellStart"/>
       <w:proofErr w:type="gramStart"/>
       <w:r>
-        <w:t>adjNodeList</w:t>
-      </w:r>
-      <w:proofErr w:type="spellEnd"/>
+        <w:t>deux</w:t>
+      </w:r>
       <w:proofErr w:type="gramEnd"/>
       <w:r>
-        <w:t xml:space="preserve">, une </w:t>
-      </w:r>
-      <w:proofErr w:type="spellStart"/>
-      <w:r>
-        <w:t>arrayList</w:t>
-      </w:r>
-      <w:proofErr w:type="spellEnd"/>
-      <w:r>
-        <w:t xml:space="preserve"> contenant les nœuds adjacents aux nœuds de </w:t>
-      </w:r>
-      <w:proofErr w:type="spellStart"/>
-      <w:r>
-        <w:t>nodeList</w:t>
-      </w:r>
-      <w:proofErr w:type="spellEnd"/>
-    </w:p>
-    <w:p>
-      <w:pPr>
-        <w:pStyle w:val="Sansinterligne"/>
-      </w:pPr>
-    </w:p>
-    <w:p>
-      <w:pPr>
-        <w:pStyle w:val="Sansinterligne"/>
-      </w:pPr>
-      <w:r>
-        <w:t xml:space="preserve">Elle a comme méthodes : </w:t>
-      </w:r>
-    </w:p>
-    <w:p>
-      <w:pPr>
-        <w:pStyle w:val="Sansinterligne"/>
-      </w:pPr>
-    </w:p>
-    <w:p>
-      <w:pPr>
-        <w:pStyle w:val="Sansinterligne"/>
+        <w:t xml:space="preserve"> getters, pour les deux listes</w:t>
+      </w:r>
+    </w:p>
+    <w:p>
+      <w:pPr>
+        <w:pStyle w:val="NoSpacing"/>
         <w:numPr>
           <w:ilvl w:val="0"/>
           <w:numId w:val="5"/>
         </w:numPr>
       </w:pPr>
+      <w:proofErr w:type="spellStart"/>
       <w:proofErr w:type="gramStart"/>
       <w:r>
-        <w:t>deux</w:t>
-      </w:r>
+        <w:t>addNode</w:t>
+      </w:r>
+      <w:proofErr w:type="spellEnd"/>
       <w:proofErr w:type="gramEnd"/>
       <w:r>
-        <w:t xml:space="preserve"> getters, pour les deux listes</w:t>
-      </w:r>
-    </w:p>
-    <w:p>
-      <w:pPr>
-        <w:pStyle w:val="Sansinterligne"/>
+        <w:t>, qui</w:t>
+      </w:r>
+    </w:p>
+    <w:p>
+      <w:pPr>
+        <w:pStyle w:val="NoSpacing"/>
         <w:numPr>
           <w:ilvl w:val="0"/>
           <w:numId w:val="5"/>
@@ -703,7 +777,7 @@
       <w:proofErr w:type="spellStart"/>
       <w:proofErr w:type="gramStart"/>
       <w:r>
-        <w:t>addNode</w:t>
+        <w:t>ajouterArc</w:t>
       </w:r>
       <w:proofErr w:type="spellEnd"/>
       <w:proofErr w:type="gramEnd"/>
@@ -713,182 +787,466 @@
     </w:p>
     <w:p>
       <w:pPr>
-        <w:pStyle w:val="Sansinterligne"/>
+        <w:pStyle w:val="NoSpacing"/>
         <w:numPr>
           <w:ilvl w:val="0"/>
           <w:numId w:val="5"/>
         </w:numPr>
       </w:pPr>
+      <w:proofErr w:type="gramStart"/>
+      <w:r>
+        <w:t>une</w:t>
+      </w:r>
+      <w:proofErr w:type="gramEnd"/>
+      <w:r>
+        <w:t xml:space="preserve"> méthode </w:t>
+      </w:r>
       <w:proofErr w:type="spellStart"/>
-      <w:proofErr w:type="gramStart"/>
-      <w:r>
-        <w:t>ajouterArc</w:t>
+      <w:r>
+        <w:t>toString</w:t>
       </w:r>
       <w:proofErr w:type="spellEnd"/>
-      <w:proofErr w:type="gramEnd"/>
-      <w:r>
-        <w:t>, qui</w:t>
-      </w:r>
-    </w:p>
-    <w:p>
-      <w:pPr>
-        <w:pStyle w:val="Sansinterligne"/>
+      <w:r>
+        <w:t xml:space="preserve"> </w:t>
+      </w:r>
+    </w:p>
+    <w:p>
+      <w:pPr>
+        <w:pStyle w:val="NoSpacing"/>
+      </w:pPr>
+    </w:p>
+    <w:p>
+      <w:pPr>
+        <w:pStyle w:val="NoSpacing"/>
+      </w:pPr>
+    </w:p>
+    <w:p>
+      <w:pPr>
+        <w:pStyle w:val="NoSpacing"/>
+      </w:pPr>
+      <w:r>
+        <w:rPr>
+          <w:b/>
+          <w:bCs/>
+        </w:rPr>
+        <w:t>Valeurs</w:t>
+      </w:r>
+      <w:r>
+        <w:t> :</w:t>
+      </w:r>
+    </w:p>
+    <w:p>
+      <w:pPr>
+        <w:pStyle w:val="NoSpacing"/>
+      </w:pPr>
+      <w:r>
+        <w:t xml:space="preserve">La classe Valeurs nous a été </w:t>
+      </w:r>
+      <w:proofErr w:type="spellStart"/>
+      <w:r>
+        <w:t>fournit</w:t>
+      </w:r>
+      <w:proofErr w:type="spellEnd"/>
+      <w:r>
+        <w:t xml:space="preserve">, nous y avons simplement ajouter la méthode </w:t>
+      </w:r>
+      <w:proofErr w:type="spellStart"/>
+      <w:r>
+        <w:t>calculerChemin</w:t>
+      </w:r>
+      <w:proofErr w:type="spellEnd"/>
+      <w:r>
+        <w:t> :</w:t>
+      </w:r>
+    </w:p>
+    <w:p>
+      <w:pPr>
+        <w:pStyle w:val="NoSpacing"/>
+      </w:pPr>
+    </w:p>
+    <w:p>
+      <w:pPr>
+        <w:pStyle w:val="NoSpacing"/>
         <w:numPr>
           <w:ilvl w:val="0"/>
           <w:numId w:val="5"/>
         </w:numPr>
       </w:pPr>
+      <w:proofErr w:type="spellStart"/>
       <w:proofErr w:type="gramStart"/>
       <w:r>
-        <w:t>une</w:t>
-      </w:r>
+        <w:t>calculerChemin</w:t>
+      </w:r>
+      <w:proofErr w:type="spellEnd"/>
       <w:proofErr w:type="gramEnd"/>
       <w:r>
-        <w:t xml:space="preserve"> méthode </w:t>
-      </w:r>
+        <w:t>, qui prend en argument un nœud, et retourne le chemin (calculé grâce à Bellman-Ford) le plus court pour rejoindre cette destination depuis le point de départ du graphe</w:t>
+      </w:r>
+    </w:p>
+    <w:p>
+      <w:pPr>
+        <w:pStyle w:val="NoSpacing"/>
+      </w:pPr>
+    </w:p>
+    <w:p>
+      <w:pPr>
+        <w:pStyle w:val="NoSpacing"/>
+      </w:pPr>
+    </w:p>
+    <w:p>
+      <w:pPr>
+        <w:pStyle w:val="NoSpacing"/>
+      </w:pPr>
       <w:proofErr w:type="spellStart"/>
       <w:r>
-        <w:t>toString</w:t>
+        <w:rPr>
+          <w:b/>
+          <w:bCs/>
+        </w:rPr>
+        <w:t>BellmanFord</w:t>
       </w:r>
       <w:proofErr w:type="spellEnd"/>
       <w:r>
-        <w:t xml:space="preserve"> </w:t>
-      </w:r>
-    </w:p>
-    <w:p>
-      <w:pPr>
-        <w:pStyle w:val="Sansinterligne"/>
-      </w:pPr>
-    </w:p>
-    <w:p>
-      <w:pPr>
-        <w:pStyle w:val="Sansinterligne"/>
-      </w:pPr>
-    </w:p>
-    <w:p>
-      <w:pPr>
-        <w:pStyle w:val="Sansinterligne"/>
-      </w:pPr>
-      <w:r>
-        <w:t>Valeurs :</w:t>
-      </w:r>
-    </w:p>
-    <w:p>
-      <w:pPr>
-        <w:pStyle w:val="Sansinterligne"/>
-      </w:pPr>
-      <w:r>
-        <w:t xml:space="preserve">La classe Valeurs nous a été </w:t>
-      </w:r>
-      <w:proofErr w:type="spellStart"/>
-      <w:r>
-        <w:t>fournit</w:t>
-      </w:r>
-      <w:proofErr w:type="spellEnd"/>
-      <w:r>
-        <w:t xml:space="preserve">, nous y avons simplement ajouter la méthode </w:t>
-      </w:r>
-      <w:proofErr w:type="spellStart"/>
-      <w:r>
-        <w:t>calculerChemin</w:t>
-      </w:r>
-      <w:proofErr w:type="spellEnd"/>
-      <w:r>
-        <w:t> :</w:t>
-      </w:r>
-    </w:p>
-    <w:p>
-      <w:pPr>
-        <w:pStyle w:val="Sansinterligne"/>
-      </w:pPr>
-    </w:p>
-    <w:p>
-      <w:pPr>
-        <w:pStyle w:val="Sansinterligne"/>
+        <w:t xml:space="preserve"> : </w:t>
+      </w:r>
+    </w:p>
+    <w:p>
+      <w:pPr>
+        <w:pStyle w:val="NoSpacing"/>
+      </w:pPr>
+    </w:p>
+    <w:p>
+      <w:pPr>
+        <w:pStyle w:val="NoSpacing"/>
+      </w:pPr>
+      <w:r>
+        <w:t>La classe permet d’implémenter l’algorithme de Bellman-Ford, ou point fixe</w:t>
+      </w:r>
+    </w:p>
+    <w:p>
+      <w:pPr>
+        <w:pStyle w:val="NoSpacing"/>
+      </w:pPr>
+      <w:r>
+        <w:t>Elle a comme méthode :</w:t>
+      </w:r>
+    </w:p>
+    <w:p>
+      <w:pPr>
+        <w:pStyle w:val="NoSpacing"/>
+      </w:pPr>
+    </w:p>
+    <w:p>
+      <w:pPr>
+        <w:pStyle w:val="NoSpacing"/>
         <w:numPr>
           <w:ilvl w:val="0"/>
           <w:numId w:val="5"/>
         </w:numPr>
       </w:pPr>
+      <w:proofErr w:type="gramStart"/>
+      <w:r>
+        <w:t>résoudre</w:t>
+      </w:r>
+      <w:proofErr w:type="gramEnd"/>
+      <w:r>
+        <w:t xml:space="preserve">, qui prend un graphe et un point de départ, </w:t>
+      </w:r>
+      <w:r>
+        <w:t>applique l’algorithme pour chercher le plus court chemin, et le renvoie.</w:t>
+      </w:r>
+    </w:p>
+    <w:p>
+      <w:pPr>
+        <w:pStyle w:val="NoSpacing"/>
+      </w:pPr>
+    </w:p>
+    <w:p>
+      <w:pPr>
+        <w:pStyle w:val="NoSpacing"/>
+      </w:pPr>
+    </w:p>
+    <w:p>
+      <w:pPr>
+        <w:pStyle w:val="NoSpacing"/>
+      </w:pPr>
+      <w:r>
+        <w:rPr>
+          <w:b/>
+          <w:bCs/>
+        </w:rPr>
+        <w:t>Dijkstra </w:t>
+      </w:r>
+      <w:r>
+        <w:t>:</w:t>
+      </w:r>
+    </w:p>
+    <w:p>
+      <w:pPr>
+        <w:pStyle w:val="NoSpacing"/>
+      </w:pPr>
+      <w:r>
+        <w:t xml:space="preserve">La classe Dijkstra permet d’implémenter l’algorithme de Dijkstra : </w:t>
+      </w:r>
+    </w:p>
+    <w:p>
+      <w:pPr>
+        <w:pStyle w:val="NoSpacing"/>
+      </w:pPr>
+    </w:p>
+    <w:p>
+      <w:pPr>
+        <w:pStyle w:val="NoSpacing"/>
+      </w:pPr>
+      <w:r>
+        <w:t>Elle s’appuie sur un Graphe (</w:t>
+      </w:r>
       <w:proofErr w:type="spellStart"/>
+      <w:r>
+        <w:t>GrapheList</w:t>
+      </w:r>
+      <w:proofErr w:type="spellEnd"/>
+      <w:r>
+        <w:t>), expliqué précédemment, implémente une « </w:t>
+      </w:r>
+      <w:proofErr w:type="spellStart"/>
+      <w:r>
+        <w:t>ArrayList</w:t>
+      </w:r>
+      <w:proofErr w:type="spellEnd"/>
+      <w:r>
+        <w:t> » de chaine de caractère</w:t>
+      </w:r>
+      <w:r>
+        <w:t xml:space="preserve"> (</w:t>
+      </w:r>
       <w:proofErr w:type="gramStart"/>
       <w:r>
-        <w:t>calculerChemin</w:t>
+        <w:t>q)</w:t>
+      </w:r>
+      <w:r>
+        <w:t xml:space="preserve">  qui</w:t>
+      </w:r>
+      <w:proofErr w:type="gramEnd"/>
+      <w:r>
+        <w:t xml:space="preserve"> stocke les sommets restant à traiter et </w:t>
+      </w:r>
+      <w:r>
+        <w:t xml:space="preserve">s’appuie sur la classe Valeur, expliqué précédemment. </w:t>
+      </w:r>
+    </w:p>
+    <w:p>
+      <w:pPr>
+        <w:pStyle w:val="NoSpacing"/>
+      </w:pPr>
+    </w:p>
+    <w:p>
+      <w:pPr>
+        <w:pStyle w:val="NoSpacing"/>
+      </w:pPr>
+      <w:r>
+        <w:t>La classe Valeurs est initialisé avec toutes les distances au maximum de la valeur qu’un double peut prendre (</w:t>
+      </w:r>
+      <w:proofErr w:type="spellStart"/>
+      <w:r>
+        <w:t>Double.MAX_VALUE</w:t>
       </w:r>
       <w:proofErr w:type="spellEnd"/>
+      <w:r>
+        <w:t xml:space="preserve">) et les parents à </w:t>
+      </w:r>
+      <w:proofErr w:type="spellStart"/>
+      <w:r>
+        <w:t>null</w:t>
+      </w:r>
+      <w:proofErr w:type="spellEnd"/>
+      <w:r>
+        <w:t xml:space="preserve"> (sauf le nœud de départ qui est à 0.0).</w:t>
+      </w:r>
+    </w:p>
+    <w:p>
+      <w:pPr>
+        <w:pStyle w:val="NoSpacing"/>
+      </w:pPr>
+      <w:r>
+        <w:t>La liste q se vide à chaque itération et les dictionnaires (</w:t>
+      </w:r>
+      <w:proofErr w:type="spellStart"/>
+      <w:r>
+        <w:t>treeMap</w:t>
+      </w:r>
+      <w:proofErr w:type="spellEnd"/>
+      <w:r>
+        <w:t xml:space="preserve">) se mettent à jour. Lorsque le chemin le plus court vers un nœud voisin qui est encore dans q est trouvé, sa distance est </w:t>
+      </w:r>
+      <w:proofErr w:type="gramStart"/>
+      <w:r>
+        <w:t>mis</w:t>
+      </w:r>
       <w:proofErr w:type="gramEnd"/>
       <w:r>
-        <w:t>, qui prend en argument un nœud, et retourne le chemin (calculé grâce à Bellman-Ford) le plus court pour rejoindre cette destination depuis le point de départ du graphe</w:t>
-      </w:r>
-    </w:p>
-    <w:p>
-      <w:pPr>
-        <w:pStyle w:val="Sansinterligne"/>
-      </w:pPr>
-    </w:p>
-    <w:p>
-      <w:pPr>
-        <w:pStyle w:val="Sansinterligne"/>
-      </w:pPr>
-    </w:p>
-    <w:p>
-      <w:pPr>
-        <w:pStyle w:val="Sansinterligne"/>
-      </w:pPr>
+        <w:t xml:space="preserve"> à jour par la valeur minimal pour l’atteindre depuis le nœud de départ et sont attribut parent est remplacé par le nœud qui était dans l’itération.</w:t>
+      </w:r>
+    </w:p>
+    <w:p>
+      <w:pPr>
+        <w:pStyle w:val="NoSpacing"/>
+      </w:pPr>
+    </w:p>
+    <w:p>
+      <w:pPr>
+        <w:pStyle w:val="NoSpacing"/>
+      </w:pPr>
+      <w:r>
+        <w:t>Ces structures ont été développé sur l’exemple du Graphe de l’énoncé de la SAE (Figure 1 et 3)</w:t>
+      </w:r>
+    </w:p>
+    <w:p>
+      <w:pPr>
+        <w:pStyle w:val="NoSpacing"/>
+      </w:pPr>
+    </w:p>
+    <w:p>
+      <w:pPr>
+        <w:pStyle w:val="NoSpacing"/>
+      </w:pPr>
+      <w:r>
+        <w:t xml:space="preserve">Nous avons défini des </w:t>
+      </w:r>
+      <w:r>
+        <w:t>tests</w:t>
+      </w:r>
+      <w:r>
+        <w:t xml:space="preserve"> unitaire</w:t>
+      </w:r>
+      <w:r>
+        <w:t>s</w:t>
+      </w:r>
+      <w:r>
+        <w:t xml:space="preserve"> dans la classe </w:t>
+      </w:r>
       <w:proofErr w:type="spellStart"/>
       <w:r>
-        <w:t>BellmanFord</w:t>
+        <w:t>TestDijkstra</w:t>
       </w:r>
       <w:proofErr w:type="spellEnd"/>
       <w:r>
-        <w:t xml:space="preserve"> : </w:t>
-      </w:r>
-    </w:p>
-    <w:p>
-      <w:pPr>
-        <w:pStyle w:val="Sansinterligne"/>
-      </w:pPr>
-    </w:p>
-    <w:p>
-      <w:pPr>
-        <w:pStyle w:val="Sansinterligne"/>
-      </w:pPr>
-      <w:r>
-        <w:t>La classe permet d’implémenter l’algorithme de Bellman-Ford, ou point fixe</w:t>
-      </w:r>
-    </w:p>
-    <w:p>
-      <w:pPr>
-        <w:pStyle w:val="Sansinterligne"/>
-      </w:pPr>
-      <w:r>
-        <w:t>Elle a comme méthode :</w:t>
-      </w:r>
-    </w:p>
-    <w:p>
-      <w:pPr>
-        <w:pStyle w:val="Sansinterligne"/>
-      </w:pPr>
-    </w:p>
-    <w:p>
-      <w:pPr>
-        <w:pStyle w:val="Sansinterligne"/>
+        <w:t> :</w:t>
+      </w:r>
+    </w:p>
+    <w:p>
+      <w:pPr>
+        <w:pStyle w:val="NoSpacing"/>
         <w:numPr>
           <w:ilvl w:val="0"/>
           <w:numId w:val="5"/>
         </w:numPr>
       </w:pPr>
+      <w:r>
+        <w:t xml:space="preserve">Le test </w:t>
+      </w:r>
+      <w:proofErr w:type="spellStart"/>
+      <w:r>
+        <w:t>testCheminPlusCourtDijkstra</w:t>
+      </w:r>
+      <w:proofErr w:type="spellEnd"/>
+      <w:r>
+        <w:t xml:space="preserve"> vérifie </w:t>
+      </w:r>
       <w:proofErr w:type="gramStart"/>
       <w:r>
-        <w:t>résoudre</w:t>
+        <w:t>les valeurs théorique</w:t>
       </w:r>
       <w:proofErr w:type="gramEnd"/>
       <w:r>
-        <w:t xml:space="preserve">, qui prend un graphe et un point de départ, </w:t>
-      </w:r>
-      <w:r>
-        <w:t>applique l’algorithme pour chercher le plus court chemin, et le renvoie.</w:t>
-      </w:r>
+        <w:t xml:space="preserve"> du chemin le plus court de chaque nœud envers le nœud de départ (« A »)</w:t>
+      </w:r>
+    </w:p>
+    <w:p>
+      <w:pPr>
+        <w:pStyle w:val="NoSpacing"/>
+        <w:numPr>
+          <w:ilvl w:val="0"/>
+          <w:numId w:val="5"/>
+        </w:numPr>
+      </w:pPr>
+      <w:r>
+        <w:t xml:space="preserve">Le test </w:t>
+      </w:r>
+      <w:proofErr w:type="spellStart"/>
+      <w:r>
+        <w:t>testCheminLuiMeme</w:t>
+      </w:r>
+      <w:proofErr w:type="spellEnd"/>
+      <w:r>
+        <w:t xml:space="preserve"> vérifie qu’en cherchant le chemin le plus court d’un nœud à lui-même, le coût soit de 0.0, et qu’il n’a pas de </w:t>
+      </w:r>
+      <w:proofErr w:type="gramStart"/>
+      <w:r>
+        <w:t>parents défini</w:t>
+      </w:r>
+      <w:proofErr w:type="gramEnd"/>
+      <w:r>
+        <w:t xml:space="preserve">, car la valeur de celle-ci doit être </w:t>
+      </w:r>
+      <w:proofErr w:type="spellStart"/>
+      <w:r>
+        <w:t>null</w:t>
+      </w:r>
+      <w:proofErr w:type="spellEnd"/>
+    </w:p>
+    <w:p>
+      <w:pPr>
+        <w:pStyle w:val="NoSpacing"/>
+        <w:numPr>
+          <w:ilvl w:val="0"/>
+          <w:numId w:val="5"/>
+        </w:numPr>
+      </w:pPr>
+      <w:r>
+        <w:t xml:space="preserve">Le test </w:t>
+      </w:r>
+      <w:proofErr w:type="spellStart"/>
+      <w:r>
+        <w:t>testCheminCasse</w:t>
+      </w:r>
+      <w:proofErr w:type="spellEnd"/>
+      <w:r>
+        <w:t xml:space="preserve"> vérifie que s’il on cherche le chemin d’un point à un autre qui est </w:t>
+      </w:r>
+      <w:r>
+        <w:t>inatteignable</w:t>
+      </w:r>
+      <w:r>
+        <w:t xml:space="preserve">, celui-ci doit avoir </w:t>
+      </w:r>
+      <w:proofErr w:type="spellStart"/>
+      <w:r>
+        <w:t>sont</w:t>
+      </w:r>
+      <w:proofErr w:type="spellEnd"/>
+      <w:r>
+        <w:t xml:space="preserve"> coup pour l’atteindre </w:t>
+      </w:r>
+      <w:proofErr w:type="gramStart"/>
+      <w:r>
+        <w:t>fixé</w:t>
+      </w:r>
+      <w:proofErr w:type="gramEnd"/>
+      <w:r>
+        <w:t xml:space="preserve"> à +infini et </w:t>
+      </w:r>
+      <w:proofErr w:type="gramStart"/>
+      <w:r>
+        <w:t>ses parents indéfini</w:t>
+      </w:r>
+      <w:proofErr w:type="gramEnd"/>
+    </w:p>
+    <w:p>
+      <w:pPr>
+        <w:pStyle w:val="NoSpacing"/>
+        <w:ind w:left="720"/>
+      </w:pPr>
     </w:p>
     <w:sectPr>
       <w:pgSz w:w="11906" w:h="16838"/>
@@ -1838,11 +2196,11 @@
     <w:name w:val="Normal"/>
     <w:qFormat/>
   </w:style>
-  <w:style w:type="paragraph" w:styleId="Titre1">
+  <w:style w:type="paragraph" w:styleId="Heading1">
     <w:name w:val="heading 1"/>
     <w:basedOn w:val="Normal"/>
     <w:next w:val="Normal"/>
-    <w:link w:val="Titre1Car"/>
+    <w:link w:val="Heading1Char"/>
     <w:uiPriority w:val="9"/>
     <w:qFormat/>
     <w:rsid w:val="001E3C59"/>
@@ -1859,11 +2217,11 @@
       <w:szCs w:val="40"/>
     </w:rPr>
   </w:style>
-  <w:style w:type="paragraph" w:styleId="Titre2">
+  <w:style w:type="paragraph" w:styleId="Heading2">
     <w:name w:val="heading 2"/>
     <w:basedOn w:val="Normal"/>
     <w:next w:val="Normal"/>
-    <w:link w:val="Titre2Car"/>
+    <w:link w:val="Heading2Char"/>
     <w:uiPriority w:val="9"/>
     <w:semiHidden/>
     <w:unhideWhenUsed/>
@@ -1882,11 +2240,11 @@
       <w:szCs w:val="32"/>
     </w:rPr>
   </w:style>
-  <w:style w:type="paragraph" w:styleId="Titre3">
+  <w:style w:type="paragraph" w:styleId="Heading3">
     <w:name w:val="heading 3"/>
     <w:basedOn w:val="Normal"/>
     <w:next w:val="Normal"/>
-    <w:link w:val="Titre3Car"/>
+    <w:link w:val="Heading3Char"/>
     <w:uiPriority w:val="9"/>
     <w:semiHidden/>
     <w:unhideWhenUsed/>
@@ -1905,11 +2263,11 @@
       <w:szCs w:val="28"/>
     </w:rPr>
   </w:style>
-  <w:style w:type="paragraph" w:styleId="Titre4">
+  <w:style w:type="paragraph" w:styleId="Heading4">
     <w:name w:val="heading 4"/>
     <w:basedOn w:val="Normal"/>
     <w:next w:val="Normal"/>
-    <w:link w:val="Titre4Car"/>
+    <w:link w:val="Heading4Char"/>
     <w:uiPriority w:val="9"/>
     <w:semiHidden/>
     <w:unhideWhenUsed/>
@@ -1928,11 +2286,11 @@
       <w:color w:val="0F4761" w:themeColor="accent1" w:themeShade="BF"/>
     </w:rPr>
   </w:style>
-  <w:style w:type="paragraph" w:styleId="Titre5">
+  <w:style w:type="paragraph" w:styleId="Heading5">
     <w:name w:val="heading 5"/>
     <w:basedOn w:val="Normal"/>
     <w:next w:val="Normal"/>
-    <w:link w:val="Titre5Car"/>
+    <w:link w:val="Heading5Char"/>
     <w:uiPriority w:val="9"/>
     <w:semiHidden/>
     <w:unhideWhenUsed/>
@@ -1949,11 +2307,11 @@
       <w:color w:val="0F4761" w:themeColor="accent1" w:themeShade="BF"/>
     </w:rPr>
   </w:style>
-  <w:style w:type="paragraph" w:styleId="Titre6">
+  <w:style w:type="paragraph" w:styleId="Heading6">
     <w:name w:val="heading 6"/>
     <w:basedOn w:val="Normal"/>
     <w:next w:val="Normal"/>
-    <w:link w:val="Titre6Car"/>
+    <w:link w:val="Heading6Char"/>
     <w:uiPriority w:val="9"/>
     <w:semiHidden/>
     <w:unhideWhenUsed/>
@@ -1972,11 +2330,11 @@
       <w:color w:val="595959" w:themeColor="text1" w:themeTint="A6"/>
     </w:rPr>
   </w:style>
-  <w:style w:type="paragraph" w:styleId="Titre7">
+  <w:style w:type="paragraph" w:styleId="Heading7">
     <w:name w:val="heading 7"/>
     <w:basedOn w:val="Normal"/>
     <w:next w:val="Normal"/>
-    <w:link w:val="Titre7Car"/>
+    <w:link w:val="Heading7Char"/>
     <w:uiPriority w:val="9"/>
     <w:semiHidden/>
     <w:unhideWhenUsed/>
@@ -1993,11 +2351,11 @@
       <w:color w:val="595959" w:themeColor="text1" w:themeTint="A6"/>
     </w:rPr>
   </w:style>
-  <w:style w:type="paragraph" w:styleId="Titre8">
+  <w:style w:type="paragraph" w:styleId="Heading8">
     <w:name w:val="heading 8"/>
     <w:basedOn w:val="Normal"/>
     <w:next w:val="Normal"/>
-    <w:link w:val="Titre8Car"/>
+    <w:link w:val="Heading8Char"/>
     <w:uiPriority w:val="9"/>
     <w:semiHidden/>
     <w:unhideWhenUsed/>
@@ -2016,11 +2374,11 @@
       <w:color w:val="272727" w:themeColor="text1" w:themeTint="D8"/>
     </w:rPr>
   </w:style>
-  <w:style w:type="paragraph" w:styleId="Titre9">
+  <w:style w:type="paragraph" w:styleId="Heading9">
     <w:name w:val="heading 9"/>
     <w:basedOn w:val="Normal"/>
     <w:next w:val="Normal"/>
-    <w:link w:val="Titre9Car"/>
+    <w:link w:val="Heading9Char"/>
     <w:uiPriority w:val="9"/>
     <w:semiHidden/>
     <w:unhideWhenUsed/>
@@ -2037,13 +2395,12 @@
       <w:color w:val="272727" w:themeColor="text1" w:themeTint="D8"/>
     </w:rPr>
   </w:style>
-  <w:style w:type="character" w:default="1" w:styleId="Policepardfaut">
+  <w:style w:type="character" w:default="1" w:styleId="DefaultParagraphFont">
     <w:name w:val="Default Paragraph Font"/>
     <w:uiPriority w:val="1"/>
-    <w:semiHidden/>
     <w:unhideWhenUsed/>
   </w:style>
-  <w:style w:type="table" w:default="1" w:styleId="TableauNormal">
+  <w:style w:type="table" w:default="1" w:styleId="TableNormal">
     <w:name w:val="Normal Table"/>
     <w:uiPriority w:val="99"/>
     <w:semiHidden/>
@@ -2058,16 +2415,16 @@
       </w:tblCellMar>
     </w:tblPr>
   </w:style>
-  <w:style w:type="numbering" w:default="1" w:styleId="Aucuneliste">
+  <w:style w:type="numbering" w:default="1" w:styleId="NoList">
     <w:name w:val="No List"/>
     <w:uiPriority w:val="99"/>
     <w:semiHidden/>
     <w:unhideWhenUsed/>
   </w:style>
-  <w:style w:type="character" w:customStyle="1" w:styleId="Titre1Car">
-    <w:name w:val="Titre 1 Car"/>
-    <w:basedOn w:val="Policepardfaut"/>
-    <w:link w:val="Titre1"/>
+  <w:style w:type="character" w:customStyle="1" w:styleId="Heading1Char">
+    <w:name w:val="Heading 1 Char"/>
+    <w:basedOn w:val="DefaultParagraphFont"/>
+    <w:link w:val="Heading1"/>
     <w:uiPriority w:val="9"/>
     <w:rsid w:val="001E3C59"/>
     <w:rPr>
@@ -2077,10 +2434,10 @@
       <w:szCs w:val="40"/>
     </w:rPr>
   </w:style>
-  <w:style w:type="character" w:customStyle="1" w:styleId="Titre2Car">
-    <w:name w:val="Titre 2 Car"/>
-    <w:basedOn w:val="Policepardfaut"/>
-    <w:link w:val="Titre2"/>
+  <w:style w:type="character" w:customStyle="1" w:styleId="Heading2Char">
+    <w:name w:val="Heading 2 Char"/>
+    <w:basedOn w:val="DefaultParagraphFont"/>
+    <w:link w:val="Heading2"/>
     <w:uiPriority w:val="9"/>
     <w:semiHidden/>
     <w:rsid w:val="001E3C59"/>
@@ -2091,10 +2448,10 @@
       <w:szCs w:val="32"/>
     </w:rPr>
   </w:style>
-  <w:style w:type="character" w:customStyle="1" w:styleId="Titre3Car">
-    <w:name w:val="Titre 3 Car"/>
-    <w:basedOn w:val="Policepardfaut"/>
-    <w:link w:val="Titre3"/>
+  <w:style w:type="character" w:customStyle="1" w:styleId="Heading3Char">
+    <w:name w:val="Heading 3 Char"/>
+    <w:basedOn w:val="DefaultParagraphFont"/>
+    <w:link w:val="Heading3"/>
     <w:uiPriority w:val="9"/>
     <w:semiHidden/>
     <w:rsid w:val="001E3C59"/>
@@ -2105,10 +2462,10 @@
       <w:szCs w:val="28"/>
     </w:rPr>
   </w:style>
-  <w:style w:type="character" w:customStyle="1" w:styleId="Titre4Car">
-    <w:name w:val="Titre 4 Car"/>
-    <w:basedOn w:val="Policepardfaut"/>
-    <w:link w:val="Titre4"/>
+  <w:style w:type="character" w:customStyle="1" w:styleId="Heading4Char">
+    <w:name w:val="Heading 4 Char"/>
+    <w:basedOn w:val="DefaultParagraphFont"/>
+    <w:link w:val="Heading4"/>
     <w:uiPriority w:val="9"/>
     <w:semiHidden/>
     <w:rsid w:val="001E3C59"/>
@@ -2119,10 +2476,10 @@
       <w:color w:val="0F4761" w:themeColor="accent1" w:themeShade="BF"/>
     </w:rPr>
   </w:style>
-  <w:style w:type="character" w:customStyle="1" w:styleId="Titre5Car">
-    <w:name w:val="Titre 5 Car"/>
-    <w:basedOn w:val="Policepardfaut"/>
-    <w:link w:val="Titre5"/>
+  <w:style w:type="character" w:customStyle="1" w:styleId="Heading5Char">
+    <w:name w:val="Heading 5 Char"/>
+    <w:basedOn w:val="DefaultParagraphFont"/>
+    <w:link w:val="Heading5"/>
     <w:uiPriority w:val="9"/>
     <w:semiHidden/>
     <w:rsid w:val="001E3C59"/>
@@ -2131,10 +2488,10 @@
       <w:color w:val="0F4761" w:themeColor="accent1" w:themeShade="BF"/>
     </w:rPr>
   </w:style>
-  <w:style w:type="character" w:customStyle="1" w:styleId="Titre6Car">
-    <w:name w:val="Titre 6 Car"/>
-    <w:basedOn w:val="Policepardfaut"/>
-    <w:link w:val="Titre6"/>
+  <w:style w:type="character" w:customStyle="1" w:styleId="Heading6Char">
+    <w:name w:val="Heading 6 Char"/>
+    <w:basedOn w:val="DefaultParagraphFont"/>
+    <w:link w:val="Heading6"/>
     <w:uiPriority w:val="9"/>
     <w:semiHidden/>
     <w:rsid w:val="001E3C59"/>
@@ -2145,10 +2502,10 @@
       <w:color w:val="595959" w:themeColor="text1" w:themeTint="A6"/>
     </w:rPr>
   </w:style>
-  <w:style w:type="character" w:customStyle="1" w:styleId="Titre7Car">
-    <w:name w:val="Titre 7 Car"/>
-    <w:basedOn w:val="Policepardfaut"/>
-    <w:link w:val="Titre7"/>
+  <w:style w:type="character" w:customStyle="1" w:styleId="Heading7Char">
+    <w:name w:val="Heading 7 Char"/>
+    <w:basedOn w:val="DefaultParagraphFont"/>
+    <w:link w:val="Heading7"/>
     <w:uiPriority w:val="9"/>
     <w:semiHidden/>
     <w:rsid w:val="001E3C59"/>
@@ -2157,10 +2514,10 @@
       <w:color w:val="595959" w:themeColor="text1" w:themeTint="A6"/>
     </w:rPr>
   </w:style>
-  <w:style w:type="character" w:customStyle="1" w:styleId="Titre8Car">
-    <w:name w:val="Titre 8 Car"/>
-    <w:basedOn w:val="Policepardfaut"/>
-    <w:link w:val="Titre8"/>
+  <w:style w:type="character" w:customStyle="1" w:styleId="Heading8Char">
+    <w:name w:val="Heading 8 Char"/>
+    <w:basedOn w:val="DefaultParagraphFont"/>
+    <w:link w:val="Heading8"/>
     <w:uiPriority w:val="9"/>
     <w:semiHidden/>
     <w:rsid w:val="001E3C59"/>
@@ -2171,10 +2528,10 @@
       <w:color w:val="272727" w:themeColor="text1" w:themeTint="D8"/>
     </w:rPr>
   </w:style>
-  <w:style w:type="character" w:customStyle="1" w:styleId="Titre9Car">
-    <w:name w:val="Titre 9 Car"/>
-    <w:basedOn w:val="Policepardfaut"/>
-    <w:link w:val="Titre9"/>
+  <w:style w:type="character" w:customStyle="1" w:styleId="Heading9Char">
+    <w:name w:val="Heading 9 Char"/>
+    <w:basedOn w:val="DefaultParagraphFont"/>
+    <w:link w:val="Heading9"/>
     <w:uiPriority w:val="9"/>
     <w:semiHidden/>
     <w:rsid w:val="001E3C59"/>
@@ -2183,11 +2540,11 @@
       <w:color w:val="272727" w:themeColor="text1" w:themeTint="D8"/>
     </w:rPr>
   </w:style>
-  <w:style w:type="paragraph" w:styleId="Titre">
+  <w:style w:type="paragraph" w:styleId="Title">
     <w:name w:val="Title"/>
     <w:basedOn w:val="Normal"/>
     <w:next w:val="Normal"/>
-    <w:link w:val="TitreCar"/>
+    <w:link w:val="TitleChar"/>
     <w:uiPriority w:val="10"/>
     <w:qFormat/>
     <w:rsid w:val="001E3C59"/>
@@ -2203,10 +2560,10 @@
       <w:szCs w:val="56"/>
     </w:rPr>
   </w:style>
-  <w:style w:type="character" w:customStyle="1" w:styleId="TitreCar">
-    <w:name w:val="Titre Car"/>
-    <w:basedOn w:val="Policepardfaut"/>
-    <w:link w:val="Titre"/>
+  <w:style w:type="character" w:customStyle="1" w:styleId="TitleChar">
+    <w:name w:val="Title Char"/>
+    <w:basedOn w:val="DefaultParagraphFont"/>
+    <w:link w:val="Title"/>
     <w:uiPriority w:val="10"/>
     <w:rsid w:val="001E3C59"/>
     <w:rPr>
@@ -2217,11 +2574,11 @@
       <w:szCs w:val="56"/>
     </w:rPr>
   </w:style>
-  <w:style w:type="paragraph" w:styleId="Sous-titre">
+  <w:style w:type="paragraph" w:styleId="Subtitle">
     <w:name w:val="Subtitle"/>
     <w:basedOn w:val="Normal"/>
     <w:next w:val="Normal"/>
-    <w:link w:val="Sous-titreCar"/>
+    <w:link w:val="SubtitleChar"/>
     <w:uiPriority w:val="11"/>
     <w:qFormat/>
     <w:rsid w:val="001E3C59"/>
@@ -2238,10 +2595,10 @@
       <w:szCs w:val="28"/>
     </w:rPr>
   </w:style>
-  <w:style w:type="character" w:customStyle="1" w:styleId="Sous-titreCar">
-    <w:name w:val="Sous-titre Car"/>
-    <w:basedOn w:val="Policepardfaut"/>
-    <w:link w:val="Sous-titre"/>
+  <w:style w:type="character" w:customStyle="1" w:styleId="SubtitleChar">
+    <w:name w:val="Subtitle Char"/>
+    <w:basedOn w:val="DefaultParagraphFont"/>
+    <w:link w:val="Subtitle"/>
     <w:uiPriority w:val="11"/>
     <w:rsid w:val="001E3C59"/>
     <w:rPr>
@@ -2252,11 +2609,11 @@
       <w:szCs w:val="28"/>
     </w:rPr>
   </w:style>
-  <w:style w:type="paragraph" w:styleId="Citation">
+  <w:style w:type="paragraph" w:styleId="Quote">
     <w:name w:val="Quote"/>
     <w:basedOn w:val="Normal"/>
     <w:next w:val="Normal"/>
-    <w:link w:val="CitationCar"/>
+    <w:link w:val="QuoteChar"/>
     <w:uiPriority w:val="29"/>
     <w:qFormat/>
     <w:rsid w:val="001E3C59"/>
@@ -2270,10 +2627,10 @@
       <w:color w:val="404040" w:themeColor="text1" w:themeTint="BF"/>
     </w:rPr>
   </w:style>
-  <w:style w:type="character" w:customStyle="1" w:styleId="CitationCar">
-    <w:name w:val="Citation Car"/>
-    <w:basedOn w:val="Policepardfaut"/>
-    <w:link w:val="Citation"/>
+  <w:style w:type="character" w:customStyle="1" w:styleId="QuoteChar">
+    <w:name w:val="Quote Char"/>
+    <w:basedOn w:val="DefaultParagraphFont"/>
+    <w:link w:val="Quote"/>
     <w:uiPriority w:val="29"/>
     <w:rsid w:val="001E3C59"/>
     <w:rPr>
@@ -2282,7 +2639,7 @@
       <w:color w:val="404040" w:themeColor="text1" w:themeTint="BF"/>
     </w:rPr>
   </w:style>
-  <w:style w:type="paragraph" w:styleId="Paragraphedeliste">
+  <w:style w:type="paragraph" w:styleId="ListParagraph">
     <w:name w:val="List Paragraph"/>
     <w:basedOn w:val="Normal"/>
     <w:uiPriority w:val="34"/>
@@ -2293,9 +2650,9 @@
       <w:contextualSpacing/>
     </w:pPr>
   </w:style>
-  <w:style w:type="character" w:styleId="Accentuationintense">
+  <w:style w:type="character" w:styleId="IntenseEmphasis">
     <w:name w:val="Intense Emphasis"/>
-    <w:basedOn w:val="Policepardfaut"/>
+    <w:basedOn w:val="DefaultParagraphFont"/>
     <w:uiPriority w:val="21"/>
     <w:qFormat/>
     <w:rsid w:val="001E3C59"/>
@@ -2305,11 +2662,11 @@
       <w:color w:val="0F4761" w:themeColor="accent1" w:themeShade="BF"/>
     </w:rPr>
   </w:style>
-  <w:style w:type="paragraph" w:styleId="Citationintense">
+  <w:style w:type="paragraph" w:styleId="IntenseQuote">
     <w:name w:val="Intense Quote"/>
     <w:basedOn w:val="Normal"/>
     <w:next w:val="Normal"/>
-    <w:link w:val="CitationintenseCar"/>
+    <w:link w:val="IntenseQuoteChar"/>
     <w:uiPriority w:val="30"/>
     <w:qFormat/>
     <w:rsid w:val="001E3C59"/>
@@ -2328,10 +2685,10 @@
       <w:color w:val="0F4761" w:themeColor="accent1" w:themeShade="BF"/>
     </w:rPr>
   </w:style>
-  <w:style w:type="character" w:customStyle="1" w:styleId="CitationintenseCar">
-    <w:name w:val="Citation intense Car"/>
-    <w:basedOn w:val="Policepardfaut"/>
-    <w:link w:val="Citationintense"/>
+  <w:style w:type="character" w:customStyle="1" w:styleId="IntenseQuoteChar">
+    <w:name w:val="Intense Quote Char"/>
+    <w:basedOn w:val="DefaultParagraphFont"/>
+    <w:link w:val="IntenseQuote"/>
     <w:uiPriority w:val="30"/>
     <w:rsid w:val="001E3C59"/>
     <w:rPr>
@@ -2340,9 +2697,9 @@
       <w:color w:val="0F4761" w:themeColor="accent1" w:themeShade="BF"/>
     </w:rPr>
   </w:style>
-  <w:style w:type="character" w:styleId="Rfrenceintense">
+  <w:style w:type="character" w:styleId="IntenseReference">
     <w:name w:val="Intense Reference"/>
-    <w:basedOn w:val="Policepardfaut"/>
+    <w:basedOn w:val="DefaultParagraphFont"/>
     <w:uiPriority w:val="32"/>
     <w:qFormat/>
     <w:rsid w:val="001E3C59"/>
@@ -2354,7 +2711,7 @@
       <w:spacing w:val="5"/>
     </w:rPr>
   </w:style>
-  <w:style w:type="paragraph" w:styleId="Sansinterligne">
+  <w:style w:type="paragraph" w:styleId="NoSpacing">
     <w:name w:val="No Spacing"/>
     <w:uiPriority w:val="1"/>
     <w:qFormat/>
@@ -2362,6 +2719,36 @@
     <w:pPr>
       <w:spacing w:after="0" w:line="240" w:lineRule="auto"/>
     </w:pPr>
+  </w:style>
+  <w:style w:type="paragraph" w:styleId="HTMLPreformatted">
+    <w:name w:val="HTML Preformatted"/>
+    <w:basedOn w:val="Normal"/>
+    <w:link w:val="HTMLPreformattedChar"/>
+    <w:uiPriority w:val="99"/>
+    <w:semiHidden/>
+    <w:unhideWhenUsed/>
+    <w:rsid w:val="008B3C12"/>
+    <w:pPr>
+      <w:spacing w:after="0" w:line="240" w:lineRule="auto"/>
+    </w:pPr>
+    <w:rPr>
+      <w:rFonts w:ascii="Consolas" w:hAnsi="Consolas"/>
+      <w:sz w:val="20"/>
+      <w:szCs w:val="20"/>
+    </w:rPr>
+  </w:style>
+  <w:style w:type="character" w:customStyle="1" w:styleId="HTMLPreformattedChar">
+    <w:name w:val="HTML Preformatted Char"/>
+    <w:basedOn w:val="DefaultParagraphFont"/>
+    <w:link w:val="HTMLPreformatted"/>
+    <w:uiPriority w:val="99"/>
+    <w:semiHidden/>
+    <w:rsid w:val="008B3C12"/>
+    <w:rPr>
+      <w:rFonts w:ascii="Consolas" w:hAnsi="Consolas"/>
+      <w:sz w:val="20"/>
+      <w:szCs w:val="20"/>
+    </w:rPr>
   </w:style>
 </w:styles>
 </file>

</xml_diff>